<commit_message>
Regenerate JATM R1 submission package with updated tables, figures, and cover letter
Co-Authored-By: Tatsuki Onishi <bougtoir@gmail.com>
</commit_message>
<xml_diff>
--- a/vaporizer-price-study/papers/jatm_cover_letter.docx
+++ b/vaporizer-price-study/papers/jatm_cover_letter.docx
@@ -27,12 +27,12 @@
     <w:p/>
     <w:p>
       <w:r>
-        <w:t>We are resubmitting our revised manuscript entitled "Targeted environmental regulation and secondary market vaporizer prices: an observational analysis of the EU desflurane phase-out" (Manuscript Number JATMED-D-26-00064) for reconsideration as an Article in the Journal of Anesthesia and Translational Medicine.</w:t>
+        <w:t>We are resubmitting our revised manuscript entitled "Association between the EU desflurane phase-out and secondary market vaporizer prices: an observational time-series analysis" (Manuscript Number JATMED-D-26-00064R1) for reconsideration as an Article in the Journal of Anesthesia and Translational Medicine.</w:t>
       </w:r>
     </w:p>
     <w:p>
       <w:r>
-        <w:t>We thank the Editor and the two reviewers for their constructive feedback. In this revision we have (1) added sensitivity and control-series analyses including bootstrap resampling, post-hoc power simulation, a comparative interrupted time-series model, and a transaction-level difference-in-differences analysis; (2) softened the causal interpretation throughout and replaced "ban/prohibited" with accurate wording about a restriction on routine use with documented clinical exceptions; (3) expanded the clinical and environmental context, including desflurane pharmacokinetic advantages, the debate over GWP100 for short-lived anesthetics, and the importance of anesthetic diversity for supply-chain resilience; and (4) strengthened the limitations section regarding confounders, eBay generalizability, EU/non-EU transaction uncertainty, and the small post-restriction sample. A detailed point-by-point response to reviewers is enclosed.</w:t>
+        <w:t>We thank the Editor and the two reviewers for their constructive feedback. In this minor revision we have (1) further softened the causal language in the title and abstract; (2) clarified that the short post-restriction window reflects the Terapeak three-year historical window ending at data extraction in March 2026; (3) explicitly interpreted the non-significant transaction-level DiD post-restriction coefficient in light of a violated parallel-trend assumption; and (4) added an acknowledgment that trend tests across three agents raise a multiple-testing concern, with isoflurane reaching nominal significance in two transaction-level tests but not in the quarterly median analysis and with small effect sizes. A detailed point-by-point response to reviewers is enclosed.</w:t>
       </w:r>
     </w:p>
     <w:p>
@@ -54,22 +54,22 @@
     <w:p/>
     <w:p>
       <w:r>
-        <w:t>[Corresponding author name]</w:t>
+        <w:t>Onishi Tatsuki</w:t>
       </w:r>
     </w:p>
     <w:p>
       <w:r>
-        <w:t>[Department, Institution]</w:t>
+        <w:t>Data Science and AI Innovation Research Promotion Center, Shiga University</w:t>
       </w:r>
     </w:p>
     <w:p>
       <w:r>
-        <w:t>[Address]</w:t>
+        <w:t>1-1-1, Bamba, Hikone, Shiga, 522-8522, Japan</w:t>
       </w:r>
     </w:p>
     <w:p>
       <w:r>
-        <w:t>[Email]</w:t>
+        <w:t>E-mail: bougtoir@gmail.com</w:t>
       </w:r>
     </w:p>
     <w:sectPr>

</xml_diff>